<commit_message>
feat(core): render anchored textbox stories with per-page page fields
Anchored wps:txbx drawings render their w:txbxContent read-only, clipped to
the extent, in body, header, and footer stories. PAGE / NUMPAGES /
SECTIONPAGES fields inside header/footer textboxes evaluate per page through
the existing field-projection path; cached field result text is never
painted. MC-wrapped textboxes stop being invisible while charts, diagrams,
and groups keep their placeholder behaviour.

Also fixes three defects this surfaced: story page-field detection never
descended into drawings nested inside runs; paint re-based page-relative
header/footer anchors by the story box, double-counting most of the page
height for footers; and the serializer left CR/LF/TAB literal in attribute
values, which attribute-value normalization silently destroyed on reopen.
</commit_message>
<xml_diff>
--- a/e2e/fixtures/header-footer-textbox.docx
+++ b/e2e/fixtures/header-footer-textbox.docx
@@ -1,6 +1,6 @@
 
 <file path=word/document.xml><?xml version="1.0" encoding="utf-8"?>
-<w:document xmlns:w="http://schemas.openxmlformats.org/wordprocessingml/2006/main" xmlns:r="http://schemas.openxmlformats.org/officeDocument/2006/relationships" xmlns:mc="http://schemas.openxmlformats.org/markup-compatibility/2006" xmlns:wp="http://schemas.openxmlformats.org/drawingml/2006/wordprocessingDrawing" xmlns:a="http://schemas.openxmlformats.org/drawingml/2006/main" xmlns:wps="http://schemas.microsoft.com/office/word/2010/wordprocessingShape" mc:Ignorable="w14 wp14">
+<w:document xmlns:wp14="http://schemas.microsoft.com/office/word/2010/wordprocessingDrawing" xmlns:w14="http://schemas.microsoft.com/office/word/2010/wordml" xmlns:w="http://schemas.openxmlformats.org/wordprocessingml/2006/main" xmlns:r="http://schemas.openxmlformats.org/officeDocument/2006/relationships" xmlns:mc="http://schemas.openxmlformats.org/markup-compatibility/2006" xmlns:wp="http://schemas.openxmlformats.org/drawingml/2006/wordprocessingDrawing" xmlns:a="http://schemas.openxmlformats.org/drawingml/2006/main" xmlns:wps="http://schemas.microsoft.com/office/word/2010/wordprocessingShape" mc:Ignorable="w14 wp14">
   <w:body>
     <w:p>
       <w:r>
@@ -92,7 +92,7 @@
 </file>
 
 <file path=word/footer1.xml><?xml version="1.0" encoding="utf-8"?>
-<w:ftr xmlns:w="http://schemas.openxmlformats.org/wordprocessingml/2006/main" xmlns:r="http://schemas.openxmlformats.org/officeDocument/2006/relationships" xmlns:mc="http://schemas.openxmlformats.org/markup-compatibility/2006" xmlns:wp="http://schemas.openxmlformats.org/drawingml/2006/wordprocessingDrawing" xmlns:a="http://schemas.openxmlformats.org/drawingml/2006/main" xmlns:wps="http://schemas.microsoft.com/office/word/2010/wordprocessingShape" mc:Ignorable="w14 wp14">
+<w:ftr xmlns:wp14="http://schemas.microsoft.com/office/word/2010/wordprocessingDrawing" xmlns:w14="http://schemas.microsoft.com/office/word/2010/wordml" xmlns:w="http://schemas.openxmlformats.org/wordprocessingml/2006/main" xmlns:r="http://schemas.openxmlformats.org/officeDocument/2006/relationships" xmlns:mc="http://schemas.openxmlformats.org/markup-compatibility/2006" xmlns:wp="http://schemas.openxmlformats.org/drawingml/2006/wordprocessingDrawing" xmlns:a="http://schemas.openxmlformats.org/drawingml/2006/main" xmlns:wps="http://schemas.microsoft.com/office/word/2010/wordprocessingShape" mc:Ignorable="w14 wp14">
   <w:p>
     <w:r>
       <w:t xml:space="preserve">Plain footer text.</w:t>
@@ -164,7 +164,7 @@
 </file>
 
 <file path=word/header1.xml><?xml version="1.0" encoding="utf-8"?>
-<w:hdr xmlns:w="http://schemas.openxmlformats.org/wordprocessingml/2006/main" xmlns:r="http://schemas.openxmlformats.org/officeDocument/2006/relationships" xmlns:mc="http://schemas.openxmlformats.org/markup-compatibility/2006" xmlns:wp="http://schemas.openxmlformats.org/drawingml/2006/wordprocessingDrawing" xmlns:a="http://schemas.openxmlformats.org/drawingml/2006/main" xmlns:wps="http://schemas.microsoft.com/office/word/2010/wordprocessingShape" mc:Ignorable="w14 wp14">
+<w:hdr xmlns:wp14="http://schemas.microsoft.com/office/word/2010/wordprocessingDrawing" xmlns:w14="http://schemas.microsoft.com/office/word/2010/wordml" xmlns:w="http://schemas.openxmlformats.org/wordprocessingml/2006/main" xmlns:r="http://schemas.openxmlformats.org/officeDocument/2006/relationships" xmlns:mc="http://schemas.openxmlformats.org/markup-compatibility/2006" xmlns:wp="http://schemas.openxmlformats.org/drawingml/2006/wordprocessingDrawing" xmlns:a="http://schemas.openxmlformats.org/drawingml/2006/main" xmlns:wps="http://schemas.microsoft.com/office/word/2010/wordprocessingShape" mc:Ignorable="w14 wp14">
   <w:p>
     <w:r>
       <w:t xml:space="preserve">Plain header text.</w:t>

</xml_diff>